<commit_message>
new thingies, trying finally add lots of tracks in spotify + ya.music Ж.
NOT FUCKING WORKING!!!!11!!111!11!!!
</commit_message>
<xml_diff>
--- a/отчет курсовая япы.docx
+++ b/отчет курсовая япы.docx
@@ -3423,6 +3423,7 @@
           <w:szCs w:val="28"/>
         </w:rPr>
       </w:pPr>
+      <w:proofErr w:type="spellStart"/>
       <w:r>
         <w:rPr>
           <w:color w:val="auto"/>
@@ -3431,6 +3432,7 @@
         </w:rPr>
         <w:t>Ляляля</w:t>
       </w:r>
+      <w:proofErr w:type="spellEnd"/>
     </w:p>
     <w:p>
       <w:pPr>
@@ -3532,6 +3534,7 @@
           <w:szCs w:val="28"/>
         </w:rPr>
       </w:pPr>
+      <w:proofErr w:type="spellStart"/>
       <w:r>
         <w:rPr>
           <w:color w:val="auto"/>
@@ -3540,6 +3543,7 @@
         </w:rPr>
         <w:t>Скибидди</w:t>
       </w:r>
+      <w:proofErr w:type="spellEnd"/>
     </w:p>
     <w:p>
       <w:pPr>
@@ -3576,14 +3580,34 @@
           <w:szCs w:val="28"/>
         </w:rPr>
       </w:pPr>
-      <w:r>
-        <w:rPr>
-          <w:color w:val="auto"/>
-          <w:sz w:val="28"/>
-          <w:szCs w:val="28"/>
-        </w:rPr>
-        <w:t>Ес ес</w:t>
-      </w:r>
+      <w:proofErr w:type="spellStart"/>
+      <w:r>
+        <w:rPr>
+          <w:color w:val="auto"/>
+          <w:sz w:val="28"/>
+          <w:szCs w:val="28"/>
+        </w:rPr>
+        <w:t>Ес</w:t>
+      </w:r>
+      <w:proofErr w:type="spellEnd"/>
+      <w:r>
+        <w:rPr>
+          <w:color w:val="auto"/>
+          <w:sz w:val="28"/>
+          <w:szCs w:val="28"/>
+        </w:rPr>
+        <w:t xml:space="preserve"> </w:t>
+      </w:r>
+      <w:proofErr w:type="spellStart"/>
+      <w:r>
+        <w:rPr>
+          <w:color w:val="auto"/>
+          <w:sz w:val="28"/>
+          <w:szCs w:val="28"/>
+        </w:rPr>
+        <w:t>ес</w:t>
+      </w:r>
+      <w:proofErr w:type="spellEnd"/>
       <w:r>
         <w:rPr>
           <w:color w:val="auto"/>
@@ -4799,6 +4823,35 @@
     <w:p>
       <w:pPr>
         <w:spacing w:after="0" w:line="360" w:lineRule="auto"/>
+        <w:ind w:left="719" w:firstLine="0"/>
+        <w:rPr>
+          <w:color w:val="auto"/>
+          <w:sz w:val="28"/>
+          <w:szCs w:val="28"/>
+        </w:rPr>
+      </w:pPr>
+      <w:bookmarkStart w:id="13" w:name="_Toc104940972"/>
+      <w:r>
+        <w:rPr>
+          <w:color w:val="auto"/>
+          <w:sz w:val="28"/>
+          <w:szCs w:val="28"/>
+        </w:rPr>
+        <w:t xml:space="preserve">+ Есть </w:t>
+      </w:r>
+      <w:r>
+        <w:rPr>
+          <w:color w:val="auto"/>
+          <w:sz w:val="28"/>
+          <w:szCs w:val="28"/>
+          <w:lang w:val="en-US"/>
+        </w:rPr>
+        <w:t>exe</w:t>
+      </w:r>
+    </w:p>
+    <w:p>
+      <w:pPr>
+        <w:spacing w:after="0" w:line="360" w:lineRule="auto"/>
         <w:ind w:firstLine="709"/>
         <w:rPr>
           <w:color w:val="auto"/>
@@ -4806,7 +4859,6 @@
           <w:szCs w:val="28"/>
         </w:rPr>
       </w:pPr>
-      <w:bookmarkStart w:id="13" w:name="_Toc104940972"/>
       <w:r>
         <w:rPr>
           <w:color w:val="auto"/>
@@ -4821,7 +4873,7 @@
           <w:sz w:val="28"/>
           <w:szCs w:val="28"/>
         </w:rPr>
-        <w:t xml:space="preserve">Есть </w:t>
+        <w:t xml:space="preserve">есть небольшое подобие на </w:t>
       </w:r>
       <w:r>
         <w:rPr>
@@ -4830,7 +4882,7 @@
           <w:szCs w:val="28"/>
           <w:lang w:val="en-US"/>
         </w:rPr>
-        <w:t>exe</w:t>
+        <w:t>UI</w:t>
       </w:r>
     </w:p>
     <w:p>
@@ -4849,16 +4901,89 @@
           <w:sz w:val="28"/>
           <w:szCs w:val="28"/>
         </w:rPr>
-        <w:t xml:space="preserve">+ </w:t>
-      </w:r>
-      <w:r>
-        <w:rPr>
-          <w:color w:val="auto"/>
-          <w:sz w:val="28"/>
-          <w:szCs w:val="28"/>
-        </w:rPr>
-        <w:t xml:space="preserve">есть небольшое подобие на </w:t>
-      </w:r>
+        <w:t>+</w:t>
+      </w:r>
+      <w:r>
+        <w:rPr>
+          <w:color w:val="auto"/>
+          <w:sz w:val="28"/>
+          <w:szCs w:val="28"/>
+        </w:rPr>
+        <w:t xml:space="preserve">Треки из </w:t>
+      </w:r>
+      <w:proofErr w:type="spellStart"/>
+      <w:r>
+        <w:rPr>
+          <w:color w:val="auto"/>
+          <w:sz w:val="28"/>
+          <w:szCs w:val="28"/>
+        </w:rPr>
+        <w:t>спотифая</w:t>
+      </w:r>
+      <w:proofErr w:type="spellEnd"/>
+      <w:r>
+        <w:rPr>
+          <w:color w:val="auto"/>
+          <w:sz w:val="28"/>
+          <w:szCs w:val="28"/>
+        </w:rPr>
+        <w:t xml:space="preserve"> вытаскиваются</w:t>
+      </w:r>
+    </w:p>
+    <w:p>
+      <w:pPr>
+        <w:spacing w:after="0" w:line="360" w:lineRule="auto"/>
+        <w:ind w:firstLine="709"/>
+        <w:rPr>
+          <w:color w:val="auto"/>
+          <w:sz w:val="28"/>
+          <w:szCs w:val="28"/>
+        </w:rPr>
+      </w:pPr>
+      <w:r>
+        <w:rPr>
+          <w:color w:val="auto"/>
+          <w:sz w:val="28"/>
+          <w:szCs w:val="28"/>
+        </w:rPr>
+        <w:t>-</w:t>
+      </w:r>
+      <w:r>
+        <w:rPr>
+          <w:color w:val="auto"/>
+          <w:sz w:val="28"/>
+          <w:szCs w:val="28"/>
+        </w:rPr>
+        <w:t xml:space="preserve"> количество вытаскиваемых треков ограничено сотней</w:t>
+      </w:r>
+    </w:p>
+    <w:p>
+      <w:pPr>
+        <w:spacing w:after="0" w:line="360" w:lineRule="auto"/>
+        <w:ind w:firstLine="709"/>
+        <w:rPr>
+          <w:color w:val="auto"/>
+          <w:sz w:val="28"/>
+          <w:szCs w:val="28"/>
+        </w:rPr>
+      </w:pPr>
+      <w:r>
+        <w:rPr>
+          <w:color w:val="auto"/>
+          <w:sz w:val="28"/>
+          <w:szCs w:val="28"/>
+        </w:rPr>
+        <w:t>-</w:t>
+      </w:r>
+      <w:r>
+        <w:rPr>
+          <w:color w:val="auto"/>
+          <w:sz w:val="28"/>
+          <w:szCs w:val="28"/>
+        </w:rPr>
+        <w:t xml:space="preserve"> реализован только </w:t>
+      </w:r>
+      <w:proofErr w:type="spellStart"/>
       <w:r>
         <w:rPr>
           <w:color w:val="auto"/>
@@ -4866,98 +4991,9 @@
           <w:szCs w:val="28"/>
           <w:lang w:val="en-US"/>
         </w:rPr>
-        <w:t>UI</w:t>
-      </w:r>
-    </w:p>
-    <w:p>
-      <w:pPr>
-        <w:spacing w:after="0" w:line="360" w:lineRule="auto"/>
-        <w:ind w:firstLine="709"/>
-        <w:rPr>
-          <w:color w:val="auto"/>
-          <w:sz w:val="28"/>
-          <w:szCs w:val="28"/>
-        </w:rPr>
-      </w:pPr>
-      <w:r>
-        <w:rPr>
-          <w:color w:val="auto"/>
-          <w:sz w:val="28"/>
-          <w:szCs w:val="28"/>
-        </w:rPr>
-        <w:t>+</w:t>
-      </w:r>
-      <w:r>
-        <w:rPr>
-          <w:color w:val="auto"/>
-          <w:sz w:val="28"/>
-          <w:szCs w:val="28"/>
-        </w:rPr>
-        <w:t>Треки из спотифая вытаскиваются</w:t>
-      </w:r>
-    </w:p>
-    <w:p>
-      <w:pPr>
-        <w:spacing w:after="0" w:line="360" w:lineRule="auto"/>
-        <w:ind w:firstLine="709"/>
-        <w:rPr>
-          <w:color w:val="auto"/>
-          <w:sz w:val="28"/>
-          <w:szCs w:val="28"/>
-        </w:rPr>
-      </w:pPr>
-      <w:r>
-        <w:rPr>
-          <w:color w:val="auto"/>
-          <w:sz w:val="28"/>
-          <w:szCs w:val="28"/>
-        </w:rPr>
-        <w:t>-</w:t>
-      </w:r>
-      <w:r>
-        <w:rPr>
-          <w:color w:val="auto"/>
-          <w:sz w:val="28"/>
-          <w:szCs w:val="28"/>
-        </w:rPr>
-        <w:t xml:space="preserve"> количество вытаскиваемых треков ограничено сотней</w:t>
-      </w:r>
-    </w:p>
-    <w:p>
-      <w:pPr>
-        <w:spacing w:after="0" w:line="360" w:lineRule="auto"/>
-        <w:ind w:firstLine="709"/>
-        <w:rPr>
-          <w:color w:val="auto"/>
-          <w:sz w:val="28"/>
-          <w:szCs w:val="28"/>
-        </w:rPr>
-      </w:pPr>
-      <w:r>
-        <w:rPr>
-          <w:color w:val="auto"/>
-          <w:sz w:val="28"/>
-          <w:szCs w:val="28"/>
-        </w:rPr>
-        <w:t>-</w:t>
-      </w:r>
-      <w:r>
-        <w:rPr>
-          <w:color w:val="auto"/>
-          <w:sz w:val="28"/>
-          <w:szCs w:val="28"/>
-        </w:rPr>
-        <w:t xml:space="preserve"> реализован только </w:t>
-      </w:r>
-      <w:r>
-        <w:rPr>
-          <w:color w:val="auto"/>
-          <w:sz w:val="28"/>
-          <w:szCs w:val="28"/>
-          <w:lang w:val="en-US"/>
-        </w:rPr>
         <w:t>spotify</w:t>
       </w:r>
+      <w:proofErr w:type="spellEnd"/>
     </w:p>
     <w:p>
       <w:pPr>
@@ -5763,7 +5799,61 @@
           <w:sz w:val="28"/>
           <w:szCs w:val="28"/>
         </w:rPr>
-        <w:t>Зыков, С. В. Программирование. Объектно-ориентированный подход : учебник и практикум для академического бакалавриата / С. В. Зыков. — М. : Издательство Юрайт, 2019. — 155 с.</w:t>
+        <w:t xml:space="preserve">Зыков, С. В. Программирование. Объектно-ориентированный </w:t>
+      </w:r>
+      <w:proofErr w:type="gramStart"/>
+      <w:r>
+        <w:rPr>
+          <w:color w:val="auto"/>
+          <w:sz w:val="28"/>
+          <w:szCs w:val="28"/>
+        </w:rPr>
+        <w:t>подход :</w:t>
+      </w:r>
+      <w:proofErr w:type="gramEnd"/>
+      <w:r>
+        <w:rPr>
+          <w:color w:val="auto"/>
+          <w:sz w:val="28"/>
+          <w:szCs w:val="28"/>
+        </w:rPr>
+        <w:t xml:space="preserve"> учебник и практикум для академического бакалавриата / С. В. Зыков. — </w:t>
+      </w:r>
+      <w:proofErr w:type="gramStart"/>
+      <w:r>
+        <w:rPr>
+          <w:color w:val="auto"/>
+          <w:sz w:val="28"/>
+          <w:szCs w:val="28"/>
+        </w:rPr>
+        <w:t>М. :</w:t>
+      </w:r>
+      <w:proofErr w:type="gramEnd"/>
+      <w:r>
+        <w:rPr>
+          <w:color w:val="auto"/>
+          <w:sz w:val="28"/>
+          <w:szCs w:val="28"/>
+        </w:rPr>
+        <w:t xml:space="preserve"> Издательство </w:t>
+      </w:r>
+      <w:proofErr w:type="spellStart"/>
+      <w:r>
+        <w:rPr>
+          <w:color w:val="auto"/>
+          <w:sz w:val="28"/>
+          <w:szCs w:val="28"/>
+        </w:rPr>
+        <w:t>Юрайт</w:t>
+      </w:r>
+      <w:proofErr w:type="spellEnd"/>
+      <w:r>
+        <w:rPr>
+          <w:color w:val="auto"/>
+          <w:sz w:val="28"/>
+          <w:szCs w:val="28"/>
+        </w:rPr>
+        <w:t>, 2019. — 155 с.</w:t>
       </w:r>
     </w:p>
     <w:p>
@@ -5786,7 +5876,61 @@
           <w:sz w:val="28"/>
           <w:szCs w:val="28"/>
         </w:rPr>
-        <w:t>Гниденко, И. Г. Технология разработки программного обеспечения : учеб. пособие для СПО / И. Г. Гниденко, Ф. Ф. Павлов, Д. Ю. Федоров. — М. : Издательство Юрайт, 2017. — 235 с.</w:t>
+        <w:t xml:space="preserve">Гниденко, И. Г. Технология разработки программного </w:t>
+      </w:r>
+      <w:proofErr w:type="gramStart"/>
+      <w:r>
+        <w:rPr>
+          <w:color w:val="auto"/>
+          <w:sz w:val="28"/>
+          <w:szCs w:val="28"/>
+        </w:rPr>
+        <w:t>обеспечения :</w:t>
+      </w:r>
+      <w:proofErr w:type="gramEnd"/>
+      <w:r>
+        <w:rPr>
+          <w:color w:val="auto"/>
+          <w:sz w:val="28"/>
+          <w:szCs w:val="28"/>
+        </w:rPr>
+        <w:t xml:space="preserve"> учеб. пособие для СПО / И. Г. Гниденко, Ф. Ф. Павлов, Д. Ю. Федоров. — </w:t>
+      </w:r>
+      <w:proofErr w:type="gramStart"/>
+      <w:r>
+        <w:rPr>
+          <w:color w:val="auto"/>
+          <w:sz w:val="28"/>
+          <w:szCs w:val="28"/>
+        </w:rPr>
+        <w:t>М. :</w:t>
+      </w:r>
+      <w:proofErr w:type="gramEnd"/>
+      <w:r>
+        <w:rPr>
+          <w:color w:val="auto"/>
+          <w:sz w:val="28"/>
+          <w:szCs w:val="28"/>
+        </w:rPr>
+        <w:t xml:space="preserve"> Издательство </w:t>
+      </w:r>
+      <w:proofErr w:type="spellStart"/>
+      <w:r>
+        <w:rPr>
+          <w:color w:val="auto"/>
+          <w:sz w:val="28"/>
+          <w:szCs w:val="28"/>
+        </w:rPr>
+        <w:t>Юрайт</w:t>
+      </w:r>
+      <w:proofErr w:type="spellEnd"/>
+      <w:r>
+        <w:rPr>
+          <w:color w:val="auto"/>
+          <w:sz w:val="28"/>
+          <w:szCs w:val="28"/>
+        </w:rPr>
+        <w:t>, 2017. — 235 с.</w:t>
       </w:r>
     </w:p>
     <w:p>
@@ -5809,7 +5953,79 @@
           <w:sz w:val="28"/>
           <w:szCs w:val="28"/>
         </w:rPr>
-        <w:t>Гордеев, С. И. Организация баз данных в 2 ч. Часть 2 : учебник для вузов / С. И. Гордеев, В. Н. Волошина. — 2-е изд., испр. и доп. — М. : Издательство Юрайт, 2019. — 501 с.</w:t>
+        <w:t xml:space="preserve">Гордеев, С. И. Организация баз данных в 2 ч. Часть </w:t>
+      </w:r>
+      <w:proofErr w:type="gramStart"/>
+      <w:r>
+        <w:rPr>
+          <w:color w:val="auto"/>
+          <w:sz w:val="28"/>
+          <w:szCs w:val="28"/>
+        </w:rPr>
+        <w:t>2 :</w:t>
+      </w:r>
+      <w:proofErr w:type="gramEnd"/>
+      <w:r>
+        <w:rPr>
+          <w:color w:val="auto"/>
+          <w:sz w:val="28"/>
+          <w:szCs w:val="28"/>
+        </w:rPr>
+        <w:t xml:space="preserve"> учебник для вузов / С. И. Гордеев, В. Н. Волошина. — 2-е изд., </w:t>
+      </w:r>
+      <w:proofErr w:type="spellStart"/>
+      <w:r>
+        <w:rPr>
+          <w:color w:val="auto"/>
+          <w:sz w:val="28"/>
+          <w:szCs w:val="28"/>
+        </w:rPr>
+        <w:t>испр</w:t>
+      </w:r>
+      <w:proofErr w:type="spellEnd"/>
+      <w:r>
+        <w:rPr>
+          <w:color w:val="auto"/>
+          <w:sz w:val="28"/>
+          <w:szCs w:val="28"/>
+        </w:rPr>
+        <w:t xml:space="preserve">. и доп. — </w:t>
+      </w:r>
+      <w:proofErr w:type="gramStart"/>
+      <w:r>
+        <w:rPr>
+          <w:color w:val="auto"/>
+          <w:sz w:val="28"/>
+          <w:szCs w:val="28"/>
+        </w:rPr>
+        <w:t>М. :</w:t>
+      </w:r>
+      <w:proofErr w:type="gramEnd"/>
+      <w:r>
+        <w:rPr>
+          <w:color w:val="auto"/>
+          <w:sz w:val="28"/>
+          <w:szCs w:val="28"/>
+        </w:rPr>
+        <w:t xml:space="preserve"> Издательство </w:t>
+      </w:r>
+      <w:proofErr w:type="spellStart"/>
+      <w:r>
+        <w:rPr>
+          <w:color w:val="auto"/>
+          <w:sz w:val="28"/>
+          <w:szCs w:val="28"/>
+        </w:rPr>
+        <w:t>Юрайт</w:t>
+      </w:r>
+      <w:proofErr w:type="spellEnd"/>
+      <w:r>
+        <w:rPr>
+          <w:color w:val="auto"/>
+          <w:sz w:val="28"/>
+          <w:szCs w:val="28"/>
+        </w:rPr>
+        <w:t>, 2019. — 501 с.</w:t>
       </w:r>
     </w:p>
     <w:p>
@@ -6121,6 +6337,7 @@
         </w:rPr>
         <w:t xml:space="preserve">В данном разделе отражён программный код нашего проекта. Мы считаем нецелесообразным вставлять сюда конвертированный из </w:t>
       </w:r>
+      <w:proofErr w:type="spellStart"/>
       <w:r>
         <w:rPr>
           <w:color w:val="auto"/>
@@ -6130,6 +6347,7 @@
         </w:rPr>
         <w:t>ui</w:t>
       </w:r>
+      <w:proofErr w:type="spellEnd"/>
       <w:r>
         <w:rPr>
           <w:color w:val="auto"/>
@@ -6146,6 +6364,7 @@
         </w:rPr>
         <w:t xml:space="preserve">формата в </w:t>
       </w:r>
+      <w:proofErr w:type="spellStart"/>
       <w:r>
         <w:rPr>
           <w:color w:val="auto"/>
@@ -6155,6 +6374,7 @@
         </w:rPr>
         <w:t>py</w:t>
       </w:r>
+      <w:proofErr w:type="spellEnd"/>
       <w:r>
         <w:rPr>
           <w:color w:val="auto"/>
@@ -6395,8 +6615,13 @@
             <w:pPr>
               <w:jc w:val="center"/>
             </w:pPr>
-            <w:r>
-              <w:t>Плестов С. В.</w:t>
+            <w:proofErr w:type="spellStart"/>
+            <w:r>
+              <w:t>Плестов</w:t>
+            </w:r>
+            <w:proofErr w:type="spellEnd"/>
+            <w:r>
+              <w:t xml:space="preserve"> С. В.</w:t>
             </w:r>
           </w:p>
         </w:tc>
@@ -6534,8 +6759,13 @@
               <w:jc w:val="center"/>
             </w:pPr>
             <w:r>
-              <w:t>Митин Н  М.</w:t>
-            </w:r>
+              <w:t xml:space="preserve">Митин </w:t>
+            </w:r>
+            <w:proofErr w:type="gramStart"/>
+            <w:r>
+              <w:t>Н  М.</w:t>
+            </w:r>
+            <w:proofErr w:type="gramEnd"/>
           </w:p>
         </w:tc>
         <w:tc>
@@ -7061,6 +7291,119 @@
     </w:lvl>
   </w:abstractNum>
   <w:abstractNum w:abstractNumId="3" w15:restartNumberingAfterBreak="0">
+    <w:nsid w:val="1CC32B46"/>
+    <w:multiLevelType w:val="hybridMultilevel"/>
+    <w:tmpl w:val="D556E630"/>
+    <w:lvl w:ilvl="0" w:tplc="04190001">
+      <w:start w:val="1"/>
+      <w:numFmt w:val="bullet"/>
+      <w:lvlText w:val=""/>
+      <w:lvlJc w:val="left"/>
+      <w:pPr>
+        <w:ind w:left="1439" w:hanging="360"/>
+      </w:pPr>
+      <w:rPr>
+        <w:rFonts w:ascii="Symbol" w:hAnsi="Symbol" w:hint="default"/>
+      </w:rPr>
+    </w:lvl>
+    <w:lvl w:ilvl="1" w:tplc="04190003" w:tentative="1">
+      <w:start w:val="1"/>
+      <w:numFmt w:val="bullet"/>
+      <w:lvlText w:val="o"/>
+      <w:lvlJc w:val="left"/>
+      <w:pPr>
+        <w:ind w:left="2159" w:hanging="360"/>
+      </w:pPr>
+      <w:rPr>
+        <w:rFonts w:ascii="Courier New" w:hAnsi="Courier New" w:cs="Courier New" w:hint="default"/>
+      </w:rPr>
+    </w:lvl>
+    <w:lvl w:ilvl="2" w:tplc="04190005" w:tentative="1">
+      <w:start w:val="1"/>
+      <w:numFmt w:val="bullet"/>
+      <w:lvlText w:val=""/>
+      <w:lvlJc w:val="left"/>
+      <w:pPr>
+        <w:ind w:left="2879" w:hanging="360"/>
+      </w:pPr>
+      <w:rPr>
+        <w:rFonts w:ascii="Wingdings" w:hAnsi="Wingdings" w:hint="default"/>
+      </w:rPr>
+    </w:lvl>
+    <w:lvl w:ilvl="3" w:tplc="04190001" w:tentative="1">
+      <w:start w:val="1"/>
+      <w:numFmt w:val="bullet"/>
+      <w:lvlText w:val=""/>
+      <w:lvlJc w:val="left"/>
+      <w:pPr>
+        <w:ind w:left="3599" w:hanging="360"/>
+      </w:pPr>
+      <w:rPr>
+        <w:rFonts w:ascii="Symbol" w:hAnsi="Symbol" w:hint="default"/>
+      </w:rPr>
+    </w:lvl>
+    <w:lvl w:ilvl="4" w:tplc="04190003" w:tentative="1">
+      <w:start w:val="1"/>
+      <w:numFmt w:val="bullet"/>
+      <w:lvlText w:val="o"/>
+      <w:lvlJc w:val="left"/>
+      <w:pPr>
+        <w:ind w:left="4319" w:hanging="360"/>
+      </w:pPr>
+      <w:rPr>
+        <w:rFonts w:ascii="Courier New" w:hAnsi="Courier New" w:cs="Courier New" w:hint="default"/>
+      </w:rPr>
+    </w:lvl>
+    <w:lvl w:ilvl="5" w:tplc="04190005" w:tentative="1">
+      <w:start w:val="1"/>
+      <w:numFmt w:val="bullet"/>
+      <w:lvlText w:val=""/>
+      <w:lvlJc w:val="left"/>
+      <w:pPr>
+        <w:ind w:left="5039" w:hanging="360"/>
+      </w:pPr>
+      <w:rPr>
+        <w:rFonts w:ascii="Wingdings" w:hAnsi="Wingdings" w:hint="default"/>
+      </w:rPr>
+    </w:lvl>
+    <w:lvl w:ilvl="6" w:tplc="04190001" w:tentative="1">
+      <w:start w:val="1"/>
+      <w:numFmt w:val="bullet"/>
+      <w:lvlText w:val=""/>
+      <w:lvlJc w:val="left"/>
+      <w:pPr>
+        <w:ind w:left="5759" w:hanging="360"/>
+      </w:pPr>
+      <w:rPr>
+        <w:rFonts w:ascii="Symbol" w:hAnsi="Symbol" w:hint="default"/>
+      </w:rPr>
+    </w:lvl>
+    <w:lvl w:ilvl="7" w:tplc="04190003" w:tentative="1">
+      <w:start w:val="1"/>
+      <w:numFmt w:val="bullet"/>
+      <w:lvlText w:val="o"/>
+      <w:lvlJc w:val="left"/>
+      <w:pPr>
+        <w:ind w:left="6479" w:hanging="360"/>
+      </w:pPr>
+      <w:rPr>
+        <w:rFonts w:ascii="Courier New" w:hAnsi="Courier New" w:cs="Courier New" w:hint="default"/>
+      </w:rPr>
+    </w:lvl>
+    <w:lvl w:ilvl="8" w:tplc="04190005" w:tentative="1">
+      <w:start w:val="1"/>
+      <w:numFmt w:val="bullet"/>
+      <w:lvlText w:val=""/>
+      <w:lvlJc w:val="left"/>
+      <w:pPr>
+        <w:ind w:left="7199" w:hanging="360"/>
+      </w:pPr>
+      <w:rPr>
+        <w:rFonts w:ascii="Wingdings" w:hAnsi="Wingdings" w:hint="default"/>
+      </w:rPr>
+    </w:lvl>
+  </w:abstractNum>
+  <w:abstractNum w:abstractNumId="4" w15:restartNumberingAfterBreak="0">
     <w:nsid w:val="3FDD384D"/>
     <w:multiLevelType w:val="multilevel"/>
     <w:tmpl w:val="3FDD384D"/>
@@ -7146,7 +7489,7 @@
       </w:pPr>
     </w:lvl>
   </w:abstractNum>
-  <w:abstractNum w:abstractNumId="4" w15:restartNumberingAfterBreak="0">
+  <w:abstractNum w:abstractNumId="5" w15:restartNumberingAfterBreak="0">
     <w:nsid w:val="41215EED"/>
     <w:multiLevelType w:val="multilevel"/>
     <w:tmpl w:val="BEAEAA26"/>
@@ -7269,7 +7612,7 @@
       </w:rPr>
     </w:lvl>
   </w:abstractNum>
-  <w:abstractNum w:abstractNumId="5" w15:restartNumberingAfterBreak="0">
+  <w:abstractNum w:abstractNumId="6" w15:restartNumberingAfterBreak="0">
     <w:nsid w:val="4A9164DF"/>
     <w:multiLevelType w:val="multilevel"/>
     <w:tmpl w:val="4A9164DF"/>
@@ -7358,7 +7701,120 @@
       </w:pPr>
     </w:lvl>
   </w:abstractNum>
-  <w:abstractNum w:abstractNumId="6" w15:restartNumberingAfterBreak="0">
+  <w:abstractNum w:abstractNumId="7" w15:restartNumberingAfterBreak="0">
+    <w:nsid w:val="509D6344"/>
+    <w:multiLevelType w:val="hybridMultilevel"/>
+    <w:tmpl w:val="0C185EEC"/>
+    <w:lvl w:ilvl="0" w:tplc="04190001">
+      <w:start w:val="1"/>
+      <w:numFmt w:val="bullet"/>
+      <w:lvlText w:val=""/>
+      <w:lvlJc w:val="left"/>
+      <w:pPr>
+        <w:ind w:left="1439" w:hanging="360"/>
+      </w:pPr>
+      <w:rPr>
+        <w:rFonts w:ascii="Symbol" w:hAnsi="Symbol" w:hint="default"/>
+      </w:rPr>
+    </w:lvl>
+    <w:lvl w:ilvl="1" w:tplc="04190003" w:tentative="1">
+      <w:start w:val="1"/>
+      <w:numFmt w:val="bullet"/>
+      <w:lvlText w:val="o"/>
+      <w:lvlJc w:val="left"/>
+      <w:pPr>
+        <w:ind w:left="2159" w:hanging="360"/>
+      </w:pPr>
+      <w:rPr>
+        <w:rFonts w:ascii="Courier New" w:hAnsi="Courier New" w:cs="Courier New" w:hint="default"/>
+      </w:rPr>
+    </w:lvl>
+    <w:lvl w:ilvl="2" w:tplc="04190005" w:tentative="1">
+      <w:start w:val="1"/>
+      <w:numFmt w:val="bullet"/>
+      <w:lvlText w:val=""/>
+      <w:lvlJc w:val="left"/>
+      <w:pPr>
+        <w:ind w:left="2879" w:hanging="360"/>
+      </w:pPr>
+      <w:rPr>
+        <w:rFonts w:ascii="Wingdings" w:hAnsi="Wingdings" w:hint="default"/>
+      </w:rPr>
+    </w:lvl>
+    <w:lvl w:ilvl="3" w:tplc="04190001" w:tentative="1">
+      <w:start w:val="1"/>
+      <w:numFmt w:val="bullet"/>
+      <w:lvlText w:val=""/>
+      <w:lvlJc w:val="left"/>
+      <w:pPr>
+        <w:ind w:left="3599" w:hanging="360"/>
+      </w:pPr>
+      <w:rPr>
+        <w:rFonts w:ascii="Symbol" w:hAnsi="Symbol" w:hint="default"/>
+      </w:rPr>
+    </w:lvl>
+    <w:lvl w:ilvl="4" w:tplc="04190003" w:tentative="1">
+      <w:start w:val="1"/>
+      <w:numFmt w:val="bullet"/>
+      <w:lvlText w:val="o"/>
+      <w:lvlJc w:val="left"/>
+      <w:pPr>
+        <w:ind w:left="4319" w:hanging="360"/>
+      </w:pPr>
+      <w:rPr>
+        <w:rFonts w:ascii="Courier New" w:hAnsi="Courier New" w:cs="Courier New" w:hint="default"/>
+      </w:rPr>
+    </w:lvl>
+    <w:lvl w:ilvl="5" w:tplc="04190005" w:tentative="1">
+      <w:start w:val="1"/>
+      <w:numFmt w:val="bullet"/>
+      <w:lvlText w:val=""/>
+      <w:lvlJc w:val="left"/>
+      <w:pPr>
+        <w:ind w:left="5039" w:hanging="360"/>
+      </w:pPr>
+      <w:rPr>
+        <w:rFonts w:ascii="Wingdings" w:hAnsi="Wingdings" w:hint="default"/>
+      </w:rPr>
+    </w:lvl>
+    <w:lvl w:ilvl="6" w:tplc="04190001" w:tentative="1">
+      <w:start w:val="1"/>
+      <w:numFmt w:val="bullet"/>
+      <w:lvlText w:val=""/>
+      <w:lvlJc w:val="left"/>
+      <w:pPr>
+        <w:ind w:left="5759" w:hanging="360"/>
+      </w:pPr>
+      <w:rPr>
+        <w:rFonts w:ascii="Symbol" w:hAnsi="Symbol" w:hint="default"/>
+      </w:rPr>
+    </w:lvl>
+    <w:lvl w:ilvl="7" w:tplc="04190003" w:tentative="1">
+      <w:start w:val="1"/>
+      <w:numFmt w:val="bullet"/>
+      <w:lvlText w:val="o"/>
+      <w:lvlJc w:val="left"/>
+      <w:pPr>
+        <w:ind w:left="6479" w:hanging="360"/>
+      </w:pPr>
+      <w:rPr>
+        <w:rFonts w:ascii="Courier New" w:hAnsi="Courier New" w:cs="Courier New" w:hint="default"/>
+      </w:rPr>
+    </w:lvl>
+    <w:lvl w:ilvl="8" w:tplc="04190005" w:tentative="1">
+      <w:start w:val="1"/>
+      <w:numFmt w:val="bullet"/>
+      <w:lvlText w:val=""/>
+      <w:lvlJc w:val="left"/>
+      <w:pPr>
+        <w:ind w:left="7199" w:hanging="360"/>
+      </w:pPr>
+      <w:rPr>
+        <w:rFonts w:ascii="Wingdings" w:hAnsi="Wingdings" w:hint="default"/>
+      </w:rPr>
+    </w:lvl>
+  </w:abstractNum>
+  <w:abstractNum w:abstractNumId="8" w15:restartNumberingAfterBreak="0">
     <w:nsid w:val="568F63B0"/>
     <w:multiLevelType w:val="multilevel"/>
     <w:tmpl w:val="BEAEAA26"/>
@@ -7481,7 +7937,7 @@
       </w:rPr>
     </w:lvl>
   </w:abstractNum>
-  <w:abstractNum w:abstractNumId="7" w15:restartNumberingAfterBreak="0">
+  <w:abstractNum w:abstractNumId="9" w15:restartNumberingAfterBreak="0">
     <w:nsid w:val="62193280"/>
     <w:multiLevelType w:val="multilevel"/>
     <w:tmpl w:val="62193280"/>
@@ -7567,7 +8023,7 @@
       </w:pPr>
     </w:lvl>
   </w:abstractNum>
-  <w:abstractNum w:abstractNumId="8" w15:restartNumberingAfterBreak="0">
+  <w:abstractNum w:abstractNumId="10" w15:restartNumberingAfterBreak="0">
     <w:nsid w:val="665638FE"/>
     <w:multiLevelType w:val="multilevel"/>
     <w:tmpl w:val="EC96B6A6"/>
@@ -7680,7 +8136,7 @@
       </w:rPr>
     </w:lvl>
   </w:abstractNum>
-  <w:abstractNum w:abstractNumId="9" w15:restartNumberingAfterBreak="0">
+  <w:abstractNum w:abstractNumId="11" w15:restartNumberingAfterBreak="0">
     <w:nsid w:val="69CA3BAB"/>
     <w:multiLevelType w:val="multilevel"/>
     <w:tmpl w:val="BEAEAA26"/>
@@ -7803,7 +8259,7 @@
       </w:rPr>
     </w:lvl>
   </w:abstractNum>
-  <w:abstractNum w:abstractNumId="10" w15:restartNumberingAfterBreak="0">
+  <w:abstractNum w:abstractNumId="12" w15:restartNumberingAfterBreak="0">
     <w:nsid w:val="783C7008"/>
     <w:multiLevelType w:val="hybridMultilevel"/>
     <w:tmpl w:val="5B88DF1C"/>
@@ -7890,37 +8346,43 @@
     </w:lvl>
   </w:abstractNum>
   <w:num w:numId="1" w16cid:durableId="1507014406">
-    <w:abstractNumId w:val="8"/>
+    <w:abstractNumId w:val="10"/>
   </w:num>
   <w:num w:numId="2" w16cid:durableId="1617910695">
-    <w:abstractNumId w:val="7"/>
+    <w:abstractNumId w:val="9"/>
   </w:num>
   <w:num w:numId="3" w16cid:durableId="1342201184">
-    <w:abstractNumId w:val="5"/>
+    <w:abstractNumId w:val="6"/>
   </w:num>
   <w:num w:numId="4" w16cid:durableId="1662470169">
-    <w:abstractNumId w:val="3"/>
+    <w:abstractNumId w:val="4"/>
   </w:num>
   <w:num w:numId="5" w16cid:durableId="1174951540">
     <w:abstractNumId w:val="0"/>
   </w:num>
   <w:num w:numId="6" w16cid:durableId="594558649">
-    <w:abstractNumId w:val="9"/>
+    <w:abstractNumId w:val="11"/>
   </w:num>
   <w:num w:numId="7" w16cid:durableId="2042241107">
-    <w:abstractNumId w:val="4"/>
+    <w:abstractNumId w:val="5"/>
   </w:num>
   <w:num w:numId="8" w16cid:durableId="2111780000">
-    <w:abstractNumId w:val="6"/>
+    <w:abstractNumId w:val="8"/>
   </w:num>
   <w:num w:numId="9" w16cid:durableId="1044061987">
     <w:abstractNumId w:val="1"/>
   </w:num>
   <w:num w:numId="10" w16cid:durableId="238708687">
-    <w:abstractNumId w:val="10"/>
+    <w:abstractNumId w:val="12"/>
   </w:num>
   <w:num w:numId="11" w16cid:durableId="1315068043">
     <w:abstractNumId w:val="2"/>
+  </w:num>
+  <w:num w:numId="12" w16cid:durableId="1157258574">
+    <w:abstractNumId w:val="7"/>
+  </w:num>
+  <w:num w:numId="13" w16cid:durableId="1988128966">
+    <w:abstractNumId w:val="3"/>
   </w:num>
 </w:numbering>
 </file>

</xml_diff>